<commit_message>
docs(requirements): V0.1.1 add energy-flow (Sankey) ch.7, rebrand to Siemens China
- 语义模型设计说明书 spec md+docx: V1.0 -> V0.1.1, Xeto em 0.1.1,
  new ch.7 visualization requirements (7.1 Sankey energy flow),
  company rename to Siemens China, revision row added
- design decision record: energyMatrix/docs/superpowers/specs/2026-09-16-energy-flow-design.md
- Phase 1 of gated plan; no code/trio changes
</commit_message>
<xml_diff>
--- a/output/energyMatrix-semantic-model-design-spec(1).docx
+++ b/output/energyMatrix-semantic-model-design-spec(1).docx
@@ -96,7 +96,7 @@
           <w:sz w:val="22"/>
           <w:szCs w:val="22"/>
         </w:rPr>
-        <w:t xml:space="preserve">版本 V1.0</w:t>
+        <w:t>版本 V0.1.1</w:t>
       </w:r>
     </w:p>
     <w:p>
@@ -111,7 +111,7 @@
           <w:sz w:val="22"/>
           <w:szCs w:val="22"/>
         </w:rPr>
-        <w:t xml:space="preserve">和碳技术（南京）有限公司</w:t>
+        <w:t>西门子中国</w:t>
       </w:r>
     </w:p>
     <w:p>
@@ -385,17 +385,8 @@
             <w:vAlign w:val="center"/>
           </w:tcPr>
           <w:p>
-            <w:pPr>
-              <w:spacing w:after="0" w:before="0" w:line="260"/>
-            </w:pPr>
-            <w:r>
-              <w:rPr>
-                <w:rFonts w:ascii="Microsoft YaHei" w:cs="Microsoft YaHei" w:eastAsia="Microsoft YaHei" w:hAnsi="Microsoft YaHei"/>
-                <w:color w:val="1F2933"/>
-                <w:sz w:val="18"/>
-                <w:szCs w:val="18"/>
-              </w:rPr>
-              <w:t xml:space="preserve">V1.0</w:t>
+            <w:r>
+              <w:t>V0.1.1</w:t>
             </w:r>
           </w:p>
         </w:tc>
@@ -553,17 +544,8 @@
             <w:vAlign w:val="center"/>
           </w:tcPr>
           <w:p>
-            <w:pPr>
-              <w:spacing w:after="0" w:before="0" w:line="260"/>
-            </w:pPr>
-            <w:r>
-              <w:rPr>
-                <w:rFonts w:ascii="Microsoft YaHei" w:cs="Microsoft YaHei" w:eastAsia="Microsoft YaHei" w:hAnsi="Microsoft YaHei"/>
-                <w:color w:val="1F2933"/>
-                <w:sz w:val="18"/>
-                <w:szCs w:val="18"/>
-              </w:rPr>
-              <w:t xml:space="preserve">em 0.1.0</w:t>
+            <w:r>
+              <w:t>em 0.1.1</w:t>
             </w:r>
           </w:p>
         </w:tc>
@@ -619,7 +601,7 @@
                 <w:sz w:val="18"/>
                 <w:szCs w:val="18"/>
               </w:rPr>
-              <w:t xml:space="preserve">和碳技术（南京）有限公司 · ai4building</w:t>
+              <w:t>西门子中国 · ai4building</w:t>
             </w:r>
           </w:p>
         </w:tc>
@@ -1237,6 +1219,48 @@
           </w:p>
         </w:tc>
       </w:tr>
+      <w:tr>
+        <w:tc>
+          <w:tcPr>
+            <w:tcW w:type="dxa" w:w="1080"/>
+          </w:tcPr>
+          <w:p>
+            <w:r>
+              <w:t>V0.1.1</w:t>
+            </w:r>
+          </w:p>
+        </w:tc>
+        <w:tc>
+          <w:tcPr>
+            <w:tcW w:type="dxa" w:w="1620"/>
+          </w:tcPr>
+          <w:p>
+            <w:r>
+              <w:t>2026-09</w:t>
+            </w:r>
+          </w:p>
+        </w:tc>
+        <w:tc>
+          <w:tcPr>
+            <w:tcW w:type="dxa" w:w="4680"/>
+          </w:tcPr>
+          <w:p>
+            <w:r>
+              <w:t>新增能流图（Sankey）界面需求；公司主体变更为西门子中国；版本统一为 0.1.1</w:t>
+            </w:r>
+          </w:p>
+        </w:tc>
+        <w:tc>
+          <w:tcPr>
+            <w:tcW w:type="dxa" w:w="1620"/>
+          </w:tcPr>
+          <w:p>
+            <w:r>
+              <w:t>架构组</w:t>
+            </w:r>
+          </w:p>
+        </w:tc>
+      </w:tr>
     </w:tbl>
     <w:p>
       <w:r>
@@ -2374,13 +2398,6 @@
       </w:r>
     </w:p>
     <w:p>
-      <w:pPr>
-        <w:tabs>
-          <w:tab w:val="right" w:pos="9000" w:leader="dot"/>
-        </w:tabs>
-        <w:spacing w:after="30" w:before="100" w:line="280"/>
-        <w:ind w:left="0"/>
-      </w:pPr>
       <w:r>
         <w:rPr>
           <w:rFonts w:ascii="Microsoft YaHei" w:cs="Microsoft YaHei" w:eastAsia="Microsoft YaHei" w:hAnsi="Microsoft YaHei"/>
@@ -2390,24 +2407,24 @@
           <w:sz w:val="20"/>
           <w:szCs w:val="20"/>
         </w:rPr>
-        <w:t xml:space="preserve">附录 A  Xeto 库文件清单</w:t>
-      </w:r>
+        <w:t>7  可视化与界面需求</w:t>
+        <w:tab/>
+        <w:t>19</w:t>
+      </w:r>
+    </w:p>
+    <w:p>
       <w:r>
         <w:rPr>
           <w:rFonts w:ascii="Microsoft YaHei" w:cs="Microsoft YaHei" w:eastAsia="Microsoft YaHei" w:hAnsi="Microsoft YaHei"/>
-          <w:sz w:val="19"/>
-          <w:szCs w:val="19"/>
-        </w:rPr>
+          <w:b/>
+          <w:bCs/>
+          <w:color w:val="0E2A47"/>
+          <w:sz w:val="20"/>
+          <w:szCs w:val="20"/>
+        </w:rPr>
+        <w:t>7.1  能流图（Sankey）</w:t>
         <w:tab/>
-      </w:r>
-      <w:r>
-        <w:rPr>
-          <w:rFonts w:ascii="Consolas" w:cs="Consolas" w:eastAsia="Consolas" w:hAnsi="Consolas"/>
-          <w:color w:val="5B6B7A"/>
-          <w:sz w:val="18"/>
-          <w:szCs w:val="18"/>
-        </w:rPr>
-        <w:t xml:space="preserve">19</w:t>
+        <w:t>19</w:t>
       </w:r>
     </w:p>
     <w:p>
@@ -2427,7 +2444,9 @@
           <w:sz w:val="20"/>
           <w:szCs w:val="20"/>
         </w:rPr>
-        <w:t xml:space="preserve">附录 B  对象速查表</w:t>
+        <w:t>附录 A  Xeto 库文件清单</w:t>
+        <w:tab/>
+        <w:t>20</w:t>
       </w:r>
       <w:r>
         <w:rPr>
@@ -2435,7 +2454,6 @@
           <w:sz w:val="19"/>
           <w:szCs w:val="19"/>
         </w:rPr>
-        <w:tab/>
       </w:r>
       <w:r>
         <w:rPr>
@@ -2444,7 +2462,6 @@
           <w:sz w:val="18"/>
           <w:szCs w:val="18"/>
         </w:rPr>
-        <w:t xml:space="preserve">20</w:t>
       </w:r>
     </w:p>
     <w:p>
@@ -2464,7 +2481,9 @@
           <w:sz w:val="20"/>
           <w:szCs w:val="20"/>
         </w:rPr>
-        <w:t xml:space="preserve">附录 C  枚举值全集</w:t>
+        <w:t>附录 B  对象速查表</w:t>
+        <w:tab/>
+        <w:t>21</w:t>
       </w:r>
       <w:r>
         <w:rPr>
@@ -2472,7 +2491,6 @@
           <w:sz w:val="19"/>
           <w:szCs w:val="19"/>
         </w:rPr>
-        <w:tab/>
       </w:r>
       <w:r>
         <w:rPr>
@@ -2481,7 +2499,43 @@
           <w:sz w:val="18"/>
           <w:szCs w:val="18"/>
         </w:rPr>
-        <w:t xml:space="preserve">21</w:t>
+      </w:r>
+    </w:p>
+    <w:p>
+      <w:pPr>
+        <w:tabs>
+          <w:tab w:val="right" w:pos="9000" w:leader="dot"/>
+        </w:tabs>
+        <w:spacing w:after="30" w:before="100" w:line="280"/>
+        <w:ind w:left="0"/>
+      </w:pPr>
+      <w:r>
+        <w:rPr>
+          <w:rFonts w:ascii="Microsoft YaHei" w:cs="Microsoft YaHei" w:eastAsia="Microsoft YaHei" w:hAnsi="Microsoft YaHei"/>
+          <w:b/>
+          <w:bCs/>
+          <w:color w:val="0E2A47"/>
+          <w:sz w:val="20"/>
+          <w:szCs w:val="20"/>
+        </w:rPr>
+        <w:t>附录 C  枚举值全集</w:t>
+        <w:tab/>
+        <w:t>22</w:t>
+      </w:r>
+      <w:r>
+        <w:rPr>
+          <w:rFonts w:ascii="Microsoft YaHei" w:cs="Microsoft YaHei" w:eastAsia="Microsoft YaHei" w:hAnsi="Microsoft YaHei"/>
+          <w:sz w:val="19"/>
+          <w:szCs w:val="19"/>
+        </w:rPr>
+      </w:r>
+      <w:r>
+        <w:rPr>
+          <w:rFonts w:ascii="Consolas" w:cs="Consolas" w:eastAsia="Consolas" w:hAnsi="Consolas"/>
+          <w:color w:val="5B6B7A"/>
+          <w:sz w:val="18"/>
+          <w:szCs w:val="18"/>
+        </w:rPr>
       </w:r>
     </w:p>
     <w:p>
@@ -19167,6 +19221,62 @@
           <w:szCs w:val="17"/>
         </w:rPr>
         <w:t xml:space="preserve">表 6-1  待决事项清单</w:t>
+      </w:r>
+    </w:p>
+    <w:p>
+      <w:pPr>
+        <w:pStyle w:val="Heading1"/>
+      </w:pPr>
+      <w:r>
+        <w:t>7  可视化与界面需求</w:t>
+      </w:r>
+    </w:p>
+    <w:p>
+      <w:pPr>
+        <w:pStyle w:val="Heading2"/>
+      </w:pPr>
+      <w:r>
+        <w:t>7.1  能流图（Sankey）</w:t>
+      </w:r>
+    </w:p>
+    <w:p>
+      <w:r>
+        <w:t>能流图以桑基图（Sankey）呈现建筑能源从进线到分项用能的完整流向，是能耗分析的可视化补充。本需求随 V0.1.1 新增，落地为前端第 14 屏（hash 路由 /flow，FIN 顶栏菜单「能流图」，归「监测运行」组）。</w:t>
+      </w:r>
+    </w:p>
+    <w:p>
+      <w:r>
+        <w:t>图形态：Sankey 桑基图，流向带宽度正比于能耗量，节点为表计/分项，按介质分色。</w:t>
+      </w:r>
+    </w:p>
+    <w:p>
+      <w:r>
+        <w:t>数据口径：Layer 2 能耗台账（遵守铁律 6，禁直读 L1 点位历史）；流向宽度取选定账期内的台账合计，可回看任意账期。</w:t>
+      </w:r>
+    </w:p>
+    <w:p>
+      <w:r>
+        <w:t>筛选维度：站点（必选）、账期（span）、介质（电/水/气/热/汽/油，可切换单介质视图）。</w:t>
+      </w:r>
+    </w:p>
+    <w:p>
+      <w:r>
+        <w:t>结构来源：计量树 DAG（既有 Axon 端点 emMeterTree）——源表到子表/分项逐级汇入；缺口表产出汇入「不明用能」汇点；虚拟表作为派生节点；考核表不参与汇总（沿用 3.3 的汇总语义）。</w:t>
+      </w:r>
+    </w:p>
+    <w:p>
+      <w:r>
+        <w:t>数值来源：既有 Axon 端点 emLedgerQuery.aggregate（dim 取 meter），本需求不新增后端接口、不新增 Axon 函数。</w:t>
+      </w:r>
+    </w:p>
+    <w:p>
+      <w:r>
+        <w:t>交互约定：节点 tooltip 显示表计名、能耗值与单位；台账为空时给出「先构建台账」引导，不得白屏。</w:t>
+      </w:r>
+    </w:p>
+    <w:p>
+      <w:r>
+        <w:t>权限与边界：本屏只读，不含任何写操作；节点点击钻取、实时（L1）口径为后续版本需求，不在 V0.1.1 范围。</w:t>
       </w:r>
     </w:p>
     <w:p>

</xml_diff>